<commit_message>
remove maintenance column and fix type data display (#175)
* ignore fake empty coworker.

* remove 'description' column in maintenance table.

* fix 'type' value in accessory information table.
</commit_message>
<xml_diff>
--- a/src/src/main/resources/report/maintenance-template.docx
+++ b/src/src/main/resources/report/maintenance-template.docx
@@ -139,6 +139,7 @@
               </w:rPr>
               <w:t>{{</w:t>
             </w:r>
+            <w:proofErr w:type="spellStart"/>
             <w:r>
               <w:rPr>
                 <w:rFonts w:hint="eastAsia"/>
@@ -147,6 +148,7 @@
               </w:rPr>
               <w:t>device_name</w:t>
             </w:r>
+            <w:proofErr w:type="spellEnd"/>
             <w:r>
               <w:rPr>
                 <w:sz w:val="20"/>
@@ -202,7 +204,23 @@
                 <w:sz w:val="20"/>
                 <w:szCs w:val="20"/>
               </w:rPr>
-              <w:t>{{device_department}}</w:t>
+              <w:t>{{</w:t>
+            </w:r>
+            <w:proofErr w:type="spellStart"/>
+            <w:r>
+              <w:rPr>
+                <w:sz w:val="20"/>
+                <w:szCs w:val="20"/>
+              </w:rPr>
+              <w:t>device_department</w:t>
+            </w:r>
+            <w:proofErr w:type="spellEnd"/>
+            <w:r>
+              <w:rPr>
+                <w:sz w:val="20"/>
+                <w:szCs w:val="20"/>
+              </w:rPr>
+              <w:t>}}</w:t>
             </w:r>
           </w:p>
         </w:tc>
@@ -256,6 +274,7 @@
               </w:rPr>
               <w:t>{{</w:t>
             </w:r>
+            <w:proofErr w:type="spellStart"/>
             <w:r>
               <w:rPr>
                 <w:sz w:val="20"/>
@@ -263,6 +282,7 @@
               </w:rPr>
               <w:t>device_type</w:t>
             </w:r>
+            <w:proofErr w:type="spellEnd"/>
             <w:r>
               <w:rPr>
                 <w:sz w:val="20"/>
@@ -318,7 +338,23 @@
                 <w:sz w:val="20"/>
                 <w:szCs w:val="20"/>
               </w:rPr>
-              <w:t>{{device_oem}}</w:t>
+              <w:t>{{</w:t>
+            </w:r>
+            <w:proofErr w:type="spellStart"/>
+            <w:r>
+              <w:rPr>
+                <w:sz w:val="20"/>
+                <w:szCs w:val="20"/>
+              </w:rPr>
+              <w:t>device_oem</w:t>
+            </w:r>
+            <w:proofErr w:type="spellEnd"/>
+            <w:r>
+              <w:rPr>
+                <w:sz w:val="20"/>
+                <w:szCs w:val="20"/>
+              </w:rPr>
+              <w:t>}}</w:t>
             </w:r>
           </w:p>
         </w:tc>
@@ -364,6 +400,7 @@
               </w:rPr>
               <w:t>{{</w:t>
             </w:r>
+            <w:proofErr w:type="spellStart"/>
             <w:r>
               <w:rPr>
                 <w:sz w:val="20"/>
@@ -371,6 +408,7 @@
               </w:rPr>
               <w:t>device_serial</w:t>
             </w:r>
+            <w:proofErr w:type="spellEnd"/>
             <w:r>
               <w:rPr>
                 <w:sz w:val="20"/>
@@ -426,7 +464,23 @@
                 <w:sz w:val="20"/>
                 <w:szCs w:val="20"/>
               </w:rPr>
-              <w:t>{{device_number}}</w:t>
+              <w:t>{{</w:t>
+            </w:r>
+            <w:proofErr w:type="spellStart"/>
+            <w:r>
+              <w:rPr>
+                <w:sz w:val="20"/>
+                <w:szCs w:val="20"/>
+              </w:rPr>
+              <w:t>device_number</w:t>
+            </w:r>
+            <w:proofErr w:type="spellEnd"/>
+            <w:r>
+              <w:rPr>
+                <w:sz w:val="20"/>
+                <w:szCs w:val="20"/>
+              </w:rPr>
+              <w:t>}}</w:t>
             </w:r>
           </w:p>
         </w:tc>
@@ -480,6 +534,7 @@
               </w:rPr>
               <w:t>{{</w:t>
             </w:r>
+            <w:proofErr w:type="spellStart"/>
             <w:r>
               <w:rPr>
                 <w:sz w:val="20"/>
@@ -487,6 +542,7 @@
               </w:rPr>
               <w:t>device_qr</w:t>
             </w:r>
+            <w:proofErr w:type="spellEnd"/>
             <w:r>
               <w:rPr>
                 <w:sz w:val="20"/>
@@ -634,6 +690,7 @@
               </w:rPr>
               <w:t>{{</w:t>
             </w:r>
+            <w:proofErr w:type="spellStart"/>
             <w:r>
               <w:rPr>
                 <w:rFonts w:ascii="SimSun" w:eastAsia="SimSun" w:hAnsi="SimSun" w:cs="SimSun"/>
@@ -642,6 +699,7 @@
               </w:rPr>
               <w:t>maintenance_number</w:t>
             </w:r>
+            <w:proofErr w:type="spellEnd"/>
             <w:r>
               <w:rPr>
                 <w:rFonts w:ascii="SimSun" w:eastAsia="SimSun" w:hAnsi="SimSun" w:cs="SimSun"/>
@@ -696,7 +754,25 @@
                 <w:sz w:val="20"/>
                 <w:szCs w:val="20"/>
               </w:rPr>
-              <w:t>{{maintenance_creator}}</w:t>
+              <w:t>{{</w:t>
+            </w:r>
+            <w:proofErr w:type="spellStart"/>
+            <w:r>
+              <w:rPr>
+                <w:rFonts w:ascii="SimSun" w:eastAsia="SimSun" w:hAnsi="SimSun" w:cs="SimSun"/>
+                <w:sz w:val="20"/>
+                <w:szCs w:val="20"/>
+              </w:rPr>
+              <w:t>maintenance_creator</w:t>
+            </w:r>
+            <w:proofErr w:type="spellEnd"/>
+            <w:r>
+              <w:rPr>
+                <w:rFonts w:ascii="SimSun" w:eastAsia="SimSun" w:hAnsi="SimSun" w:cs="SimSun"/>
+                <w:sz w:val="20"/>
+                <w:szCs w:val="20"/>
+              </w:rPr>
+              <w:t>}}</w:t>
             </w:r>
           </w:p>
         </w:tc>
@@ -746,7 +822,25 @@
                 <w:sz w:val="20"/>
                 <w:szCs w:val="20"/>
               </w:rPr>
-              <w:t>{{maintenance_level}}</w:t>
+              <w:t>{{</w:t>
+            </w:r>
+            <w:proofErr w:type="spellStart"/>
+            <w:r>
+              <w:rPr>
+                <w:rFonts w:ascii="SimSun" w:eastAsia="SimSun" w:hAnsi="SimSun" w:cs="SimSun"/>
+                <w:sz w:val="20"/>
+                <w:szCs w:val="20"/>
+              </w:rPr>
+              <w:t>maintenance_level</w:t>
+            </w:r>
+            <w:proofErr w:type="spellEnd"/>
+            <w:r>
+              <w:rPr>
+                <w:rFonts w:ascii="SimSun" w:eastAsia="SimSun" w:hAnsi="SimSun" w:cs="SimSun"/>
+                <w:sz w:val="20"/>
+                <w:szCs w:val="20"/>
+              </w:rPr>
+              <w:t>}}</w:t>
             </w:r>
           </w:p>
         </w:tc>
@@ -794,7 +888,25 @@
                 <w:sz w:val="20"/>
                 <w:szCs w:val="20"/>
               </w:rPr>
-              <w:t>{{maintenance_type}}</w:t>
+              <w:t>{{</w:t>
+            </w:r>
+            <w:proofErr w:type="spellStart"/>
+            <w:r>
+              <w:rPr>
+                <w:rFonts w:ascii="SimSun" w:eastAsia="SimSun" w:hAnsi="SimSun" w:cs="SimSun"/>
+                <w:sz w:val="20"/>
+                <w:szCs w:val="20"/>
+              </w:rPr>
+              <w:t>maintenance_type</w:t>
+            </w:r>
+            <w:proofErr w:type="spellEnd"/>
+            <w:r>
+              <w:rPr>
+                <w:rFonts w:ascii="SimSun" w:eastAsia="SimSun" w:hAnsi="SimSun" w:cs="SimSun"/>
+                <w:sz w:val="20"/>
+                <w:szCs w:val="20"/>
+              </w:rPr>
+              <w:t>}}</w:t>
             </w:r>
           </w:p>
         </w:tc>
@@ -844,7 +956,25 @@
                 <w:sz w:val="20"/>
                 <w:szCs w:val="20"/>
               </w:rPr>
-              <w:t>{{maintenance_plan_time}}</w:t>
+              <w:t>{{</w:t>
+            </w:r>
+            <w:proofErr w:type="spellStart"/>
+            <w:r>
+              <w:rPr>
+                <w:rFonts w:ascii="SimSun" w:eastAsia="SimSun" w:hAnsi="SimSun" w:cs="SimSun"/>
+                <w:sz w:val="20"/>
+                <w:szCs w:val="20"/>
+              </w:rPr>
+              <w:t>maintenance_plan_time</w:t>
+            </w:r>
+            <w:proofErr w:type="spellEnd"/>
+            <w:r>
+              <w:rPr>
+                <w:rFonts w:ascii="SimSun" w:eastAsia="SimSun" w:hAnsi="SimSun" w:cs="SimSun"/>
+                <w:sz w:val="20"/>
+                <w:szCs w:val="20"/>
+              </w:rPr>
+              <w:t>}}</w:t>
             </w:r>
           </w:p>
         </w:tc>
@@ -892,7 +1022,25 @@
                 <w:sz w:val="20"/>
                 <w:szCs w:val="20"/>
               </w:rPr>
-              <w:t>{{maintenance_complete_time}}</w:t>
+              <w:t>{{</w:t>
+            </w:r>
+            <w:proofErr w:type="spellStart"/>
+            <w:r>
+              <w:rPr>
+                <w:rFonts w:ascii="SimSun" w:eastAsia="SimSun" w:hAnsi="SimSun" w:cs="SimSun"/>
+                <w:sz w:val="20"/>
+                <w:szCs w:val="20"/>
+              </w:rPr>
+              <w:t>maintenance_complete_time</w:t>
+            </w:r>
+            <w:proofErr w:type="spellEnd"/>
+            <w:r>
+              <w:rPr>
+                <w:rFonts w:ascii="SimSun" w:eastAsia="SimSun" w:hAnsi="SimSun" w:cs="SimSun"/>
+                <w:sz w:val="20"/>
+                <w:szCs w:val="20"/>
+              </w:rPr>
+              <w:t>}}</w:t>
             </w:r>
           </w:p>
         </w:tc>
@@ -946,7 +1094,23 @@
                 <w:sz w:val="20"/>
                 <w:szCs w:val="20"/>
               </w:rPr>
-              <w:t>{{maintenance_op}}</w:t>
+              <w:t>{{</w:t>
+            </w:r>
+            <w:proofErr w:type="spellStart"/>
+            <w:r>
+              <w:rPr>
+                <w:sz w:val="20"/>
+                <w:szCs w:val="20"/>
+              </w:rPr>
+              <w:t>maintenance_op</w:t>
+            </w:r>
+            <w:proofErr w:type="spellEnd"/>
+            <w:r>
+              <w:rPr>
+                <w:sz w:val="20"/>
+                <w:szCs w:val="20"/>
+              </w:rPr>
+              <w:t>}}</w:t>
             </w:r>
           </w:p>
         </w:tc>
@@ -976,7 +1140,25 @@
                 <w:sz w:val="20"/>
                 <w:szCs w:val="20"/>
               </w:rPr>
-              <w:t>{{maintenance_op_time}}</w:t>
+              <w:t>{{</w:t>
+            </w:r>
+            <w:proofErr w:type="spellStart"/>
+            <w:r>
+              <w:rPr>
+                <w:rFonts w:hint="eastAsia"/>
+                <w:sz w:val="20"/>
+                <w:szCs w:val="20"/>
+              </w:rPr>
+              <w:t>maintenance_op_time</w:t>
+            </w:r>
+            <w:proofErr w:type="spellEnd"/>
+            <w:r>
+              <w:rPr>
+                <w:rFonts w:hint="eastAsia"/>
+                <w:sz w:val="20"/>
+                <w:szCs w:val="20"/>
+              </w:rPr>
+              <w:t>}}</w:t>
             </w:r>
           </w:p>
         </w:tc>
@@ -1212,7 +1394,23 @@
                 <w:sz w:val="20"/>
                 <w:szCs w:val="20"/>
               </w:rPr>
-              <w:t>{{maintenance_result}}</w:t>
+              <w:t>{{</w:t>
+            </w:r>
+            <w:proofErr w:type="spellStart"/>
+            <w:r>
+              <w:rPr>
+                <w:sz w:val="20"/>
+                <w:szCs w:val="20"/>
+              </w:rPr>
+              <w:t>maintenance_result</w:t>
+            </w:r>
+            <w:proofErr w:type="spellEnd"/>
+            <w:r>
+              <w:rPr>
+                <w:sz w:val="20"/>
+                <w:szCs w:val="20"/>
+              </w:rPr>
+              <w:t>}}</w:t>
             </w:r>
           </w:p>
         </w:tc>
@@ -1410,9 +1608,11 @@
             <w:r>
               <w:t>{{</w:t>
             </w:r>
+            <w:proofErr w:type="spellStart"/>
             <w:r>
               <w:t>accessory_information</w:t>
             </w:r>
+            <w:proofErr w:type="spellEnd"/>
             <w:r>
               <w:t>}}</w:t>
             </w:r>
@@ -1461,16 +1661,15 @@
         <w:tblLook w:val="04A0" w:firstRow="1" w:lastRow="0" w:firstColumn="1" w:lastColumn="0" w:noHBand="0" w:noVBand="1"/>
       </w:tblPr>
       <w:tblGrid>
-        <w:gridCol w:w="2158"/>
-        <w:gridCol w:w="2158"/>
-        <w:gridCol w:w="2158"/>
-        <w:gridCol w:w="2158"/>
-        <w:gridCol w:w="2158"/>
+        <w:gridCol w:w="2689"/>
+        <w:gridCol w:w="2409"/>
+        <w:gridCol w:w="2552"/>
+        <w:gridCol w:w="3140"/>
       </w:tblGrid>
       <w:tr>
         <w:tc>
           <w:tcPr>
-            <w:tcW w:w="2158" w:type="dxa"/>
+            <w:tcW w:w="2689" w:type="dxa"/>
           </w:tcPr>
           <w:p>
             <w:pPr>
@@ -1490,7 +1689,7 @@
         </w:tc>
         <w:tc>
           <w:tcPr>
-            <w:tcW w:w="2158" w:type="dxa"/>
+            <w:tcW w:w="2409" w:type="dxa"/>
           </w:tcPr>
           <w:p>
             <w:pPr>
@@ -1510,7 +1709,7 @@
         </w:tc>
         <w:tc>
           <w:tcPr>
-            <w:tcW w:w="2158" w:type="dxa"/>
+            <w:tcW w:w="2552" w:type="dxa"/>
           </w:tcPr>
           <w:p>
             <w:pPr>
@@ -1530,41 +1729,30 @@
         </w:tc>
         <w:tc>
           <w:tcPr>
-            <w:tcW w:w="2158" w:type="dxa"/>
-          </w:tcPr>
-          <w:p>
-            <w:pPr>
-              <w:jc w:val="center"/>
-              <w:rPr>
-                <w:b/>
-              </w:rPr>
-            </w:pPr>
-            <w:r>
-              <w:rPr>
-                <w:rFonts w:hint="eastAsia"/>
-                <w:b/>
-              </w:rPr>
-              <w:t>结束时间</w:t>
-            </w:r>
-          </w:p>
-        </w:tc>
-        <w:tc>
-          <w:tcPr>
-            <w:tcW w:w="2158" w:type="dxa"/>
-          </w:tcPr>
-          <w:p>
-            <w:pPr>
-              <w:jc w:val="center"/>
-              <w:rPr>
-                <w:b/>
-              </w:rPr>
-            </w:pPr>
-            <w:r>
-              <w:rPr>
-                <w:rFonts w:hint="eastAsia"/>
-                <w:b/>
-              </w:rPr>
-              <w:t>处理描述</w:t>
+            <w:tcW w:w="3140" w:type="dxa"/>
+          </w:tcPr>
+          <w:p>
+            <w:pPr>
+              <w:jc w:val="center"/>
+              <w:rPr>
+                <w:b/>
+              </w:rPr>
+            </w:pPr>
+            <w:r>
+              <w:rPr>
+                <w:rFonts w:hint="eastAsia"/>
+                <w:b/>
+              </w:rPr>
+              <w:t>结</w:t>
+            </w:r>
+            <w:bookmarkStart w:id="0" w:name="_GoBack"/>
+            <w:bookmarkEnd w:id="0"/>
+            <w:r>
+              <w:rPr>
+                <w:rFonts w:hint="eastAsia"/>
+                <w:b/>
+              </w:rPr>
+              <w:t>束时间</w:t>
             </w:r>
           </w:p>
         </w:tc>
@@ -1573,11 +1761,19 @@
         <w:tc>
           <w:tcPr>
             <w:tcW w:w="10790" w:type="dxa"/>
-            <w:gridSpan w:val="5"/>
-          </w:tcPr>
-          <w:p>
-            <w:r>
-              <w:t>{{maintenance_workflow}}</w:t>
+            <w:gridSpan w:val="4"/>
+          </w:tcPr>
+          <w:p>
+            <w:r>
+              <w:t>{{</w:t>
+            </w:r>
+            <w:proofErr w:type="spellStart"/>
+            <w:r>
+              <w:t>maintenance_workflow</w:t>
+            </w:r>
+            <w:proofErr w:type="spellEnd"/>
+            <w:r>
+              <w:t>}}</w:t>
             </w:r>
           </w:p>
         </w:tc>
@@ -1715,10 +1911,13 @@
           </w:tcPr>
           <w:p>
             <w:r>
-              <w:t>{{check_list</w:t>
-            </w:r>
-            <w:bookmarkStart w:id="0" w:name="_GoBack"/>
-            <w:bookmarkEnd w:id="0"/>
+              <w:t>{{</w:t>
+            </w:r>
+            <w:proofErr w:type="spellStart"/>
+            <w:r>
+              <w:t>check_list</w:t>
+            </w:r>
+            <w:proofErr w:type="spellEnd"/>
             <w:r>
               <w:t>}}</w:t>
             </w:r>
@@ -2503,7 +2702,7 @@
 </file>
 
 <file path=customXml/itemProps1.xml><?xml version="1.0" encoding="utf-8"?>
-<ds:datastoreItem xmlns:ds="http://schemas.openxmlformats.org/officeDocument/2006/customXml" ds:itemID="{F04A4AB7-B1FE-0F4A-9563-A8B22BBFA1B6}">
+<ds:datastoreItem xmlns:ds="http://schemas.openxmlformats.org/officeDocument/2006/customXml" ds:itemID="{B2F39607-AFCC-F54F-B5FC-42160B10BAF4}">
   <ds:schemaRefs>
     <ds:schemaRef ds:uri="http://schemas.openxmlformats.org/officeDocument/2006/bibliography"/>
   </ds:schemaRefs>

</xml_diff>

<commit_message>
JIRA#1884: fix pm order dynamic table content (#207)
* support dynamic report render.

* fix dynamic table rendering method.

* fix data content.

* update test report template.

* split dynamic report data.

* add audit message table content.

* add exception stack trace information.
</commit_message>
<xml_diff>
--- a/src/src/main/resources/report/maintenance-template.docx
+++ b/src/src/main/resources/report/maintenance-template.docx
@@ -1743,16 +1743,7 @@
                 <w:rFonts w:hint="eastAsia"/>
                 <w:b/>
               </w:rPr>
-              <w:t>结</w:t>
-            </w:r>
-            <w:bookmarkStart w:id="0" w:name="_GoBack"/>
-            <w:bookmarkEnd w:id="0"/>
-            <w:r>
-              <w:rPr>
-                <w:rFonts w:hint="eastAsia"/>
-                <w:b/>
-              </w:rPr>
-              <w:t>束时间</w:t>
+              <w:t>结束时间</w:t>
             </w:r>
           </w:p>
         </w:tc>
@@ -1779,7 +1770,134 @@
         </w:tc>
       </w:tr>
     </w:tbl>
-    <w:p/>
+    <w:p>
+      <w:pPr>
+        <w:jc w:val="center"/>
+        <w:rPr>
+          <w:rFonts w:ascii="Calibri" w:eastAsia="Microsoft YaHei" w:hAnsi="Calibri" w:cs="Calibri"/>
+          <w:b/>
+        </w:rPr>
+      </w:pPr>
+    </w:p>
+    <w:p>
+      <w:pPr>
+        <w:jc w:val="center"/>
+        <w:rPr>
+          <w:rFonts w:ascii="Microsoft YaHei" w:eastAsia="Microsoft YaHei" w:hAnsi="Microsoft YaHei"/>
+          <w:b/>
+          <w:sz w:val="24"/>
+          <w:szCs w:val="24"/>
+        </w:rPr>
+      </w:pPr>
+      <w:r>
+        <w:rPr>
+          <w:rFonts w:ascii="Microsoft YaHei" w:eastAsia="Microsoft YaHei" w:hAnsi="Microsoft YaHei" w:hint="eastAsia"/>
+          <w:b/>
+          <w:sz w:val="24"/>
+          <w:szCs w:val="24"/>
+        </w:rPr>
+        <w:t>费用审核记录</w:t>
+      </w:r>
+    </w:p>
+    <w:tbl>
+      <w:tblPr>
+        <w:tblStyle w:val="TableGrid"/>
+        <w:tblW w:w="0" w:type="auto"/>
+        <w:tblLook w:val="04A0" w:firstRow="1" w:lastRow="0" w:firstColumn="1" w:lastColumn="0" w:noHBand="0" w:noVBand="1"/>
+      </w:tblPr>
+      <w:tblGrid>
+        <w:gridCol w:w="3596"/>
+        <w:gridCol w:w="3597"/>
+        <w:gridCol w:w="3597"/>
+      </w:tblGrid>
+      <w:tr>
+        <w:tc>
+          <w:tcPr>
+            <w:tcW w:w="3596" w:type="dxa"/>
+          </w:tcPr>
+          <w:p>
+            <w:pPr>
+              <w:jc w:val="center"/>
+              <w:rPr>
+                <w:b/>
+              </w:rPr>
+            </w:pPr>
+            <w:r>
+              <w:rPr>
+                <w:rFonts w:hint="eastAsia"/>
+                <w:b/>
+              </w:rPr>
+              <w:t>时间</w:t>
+            </w:r>
+          </w:p>
+        </w:tc>
+        <w:tc>
+          <w:tcPr>
+            <w:tcW w:w="3597" w:type="dxa"/>
+          </w:tcPr>
+          <w:p>
+            <w:pPr>
+              <w:jc w:val="center"/>
+              <w:rPr>
+                <w:b/>
+              </w:rPr>
+            </w:pPr>
+            <w:r>
+              <w:rPr>
+                <w:rFonts w:hint="eastAsia"/>
+                <w:b/>
+              </w:rPr>
+              <w:t>责任人</w:t>
+            </w:r>
+          </w:p>
+        </w:tc>
+        <w:tc>
+          <w:tcPr>
+            <w:tcW w:w="3597" w:type="dxa"/>
+          </w:tcPr>
+          <w:p>
+            <w:pPr>
+              <w:jc w:val="center"/>
+              <w:rPr>
+                <w:b/>
+              </w:rPr>
+            </w:pPr>
+            <w:r>
+              <w:rPr>
+                <w:rFonts w:hint="eastAsia"/>
+                <w:b/>
+              </w:rPr>
+              <w:t>审核信息</w:t>
+            </w:r>
+          </w:p>
+        </w:tc>
+      </w:tr>
+      <w:tr>
+        <w:tc>
+          <w:tcPr>
+            <w:tcW w:w="10790" w:type="dxa"/>
+            <w:gridSpan w:val="3"/>
+          </w:tcPr>
+          <w:p>
+            <w:r>
+              <w:t>{{</w:t>
+            </w:r>
+            <w:proofErr w:type="spellStart"/>
+            <w:r>
+              <w:t>audit_records</w:t>
+            </w:r>
+            <w:proofErr w:type="spellEnd"/>
+            <w:r>
+              <w:t>}}</w:t>
+            </w:r>
+          </w:p>
+        </w:tc>
+      </w:tr>
+    </w:tbl>
+    <w:p>
+      <w:bookmarkStart w:id="0" w:name="_GoBack"/>
+      <w:bookmarkEnd w:id="0"/>
+    </w:p>
     <w:p>
       <w:pPr>
         <w:jc w:val="center"/>
@@ -1934,6 +2052,146 @@
           <w:szCs w:val="24"/>
         </w:rPr>
       </w:pPr>
+    </w:p>
+    <w:p>
+      <w:pPr>
+        <w:jc w:val="center"/>
+        <w:rPr>
+          <w:rFonts w:ascii="Microsoft YaHei" w:eastAsia="Microsoft YaHei" w:hAnsi="Microsoft YaHei"/>
+          <w:b/>
+          <w:sz w:val="24"/>
+          <w:szCs w:val="24"/>
+        </w:rPr>
+      </w:pPr>
+      <w:r>
+        <w:rPr>
+          <w:rFonts w:ascii="Microsoft YaHei" w:eastAsia="Microsoft YaHei" w:hAnsi="Microsoft YaHei" w:hint="eastAsia"/>
+          <w:b/>
+          <w:sz w:val="24"/>
+          <w:szCs w:val="24"/>
+        </w:rPr>
+        <w:t>电气安全检测报告</w:t>
+      </w:r>
+    </w:p>
+    <w:p>
+      <w:pPr>
+        <w:jc w:val="center"/>
+        <w:rPr>
+          <w:rFonts w:ascii="Microsoft YaHei" w:eastAsia="Microsoft YaHei" w:hAnsi="Microsoft YaHei"/>
+          <w:sz w:val="24"/>
+          <w:szCs w:val="24"/>
+        </w:rPr>
+      </w:pPr>
+      <w:r>
+        <w:rPr>
+          <w:rFonts w:ascii="Microsoft YaHei" w:eastAsia="Microsoft YaHei" w:hAnsi="Microsoft YaHei"/>
+          <w:sz w:val="24"/>
+          <w:szCs w:val="24"/>
+        </w:rPr>
+        <w:lastRenderedPageBreak/>
+        <w:t>{{</w:t>
+      </w:r>
+      <w:r>
+        <w:rPr>
+          <w:rFonts w:ascii="Microsoft YaHei" w:eastAsia="Microsoft YaHei" w:hAnsi="Microsoft YaHei"/>
+          <w:sz w:val="24"/>
+          <w:szCs w:val="24"/>
+        </w:rPr>
+        <w:t>#</w:t>
+      </w:r>
+      <w:proofErr w:type="spellStart"/>
+      <w:r>
+        <w:rPr>
+          <w:rFonts w:ascii="Microsoft YaHei" w:eastAsia="Microsoft YaHei" w:hAnsi="Microsoft YaHei"/>
+          <w:sz w:val="24"/>
+          <w:szCs w:val="24"/>
+        </w:rPr>
+        <w:t>safety_report</w:t>
+      </w:r>
+      <w:proofErr w:type="spellEnd"/>
+      <w:r>
+        <w:rPr>
+          <w:rFonts w:ascii="Microsoft YaHei" w:eastAsia="Microsoft YaHei" w:hAnsi="Microsoft YaHei"/>
+          <w:sz w:val="24"/>
+          <w:szCs w:val="24"/>
+        </w:rPr>
+        <w:t>}}</w:t>
+      </w:r>
+    </w:p>
+    <w:p>
+      <w:pPr>
+        <w:jc w:val="center"/>
+        <w:rPr>
+          <w:rFonts w:ascii="Microsoft YaHei" w:eastAsia="Microsoft YaHei" w:hAnsi="Microsoft YaHei"/>
+          <w:b/>
+          <w:sz w:val="24"/>
+          <w:szCs w:val="24"/>
+        </w:rPr>
+      </w:pPr>
+    </w:p>
+    <w:p>
+      <w:pPr>
+        <w:jc w:val="center"/>
+        <w:rPr>
+          <w:rFonts w:ascii="Microsoft YaHei" w:eastAsia="Microsoft YaHei" w:hAnsi="Microsoft YaHei"/>
+          <w:b/>
+          <w:sz w:val="24"/>
+          <w:szCs w:val="24"/>
+        </w:rPr>
+      </w:pPr>
+      <w:r>
+        <w:rPr>
+          <w:rFonts w:ascii="Microsoft YaHei" w:eastAsia="Microsoft YaHei" w:hAnsi="Microsoft YaHei" w:hint="eastAsia"/>
+          <w:b/>
+          <w:sz w:val="24"/>
+          <w:szCs w:val="24"/>
+        </w:rPr>
+        <w:t>性能检测报告</w:t>
+      </w:r>
+    </w:p>
+    <w:p>
+      <w:pPr>
+        <w:jc w:val="center"/>
+        <w:rPr>
+          <w:rFonts w:ascii="Microsoft YaHei" w:eastAsia="Microsoft YaHei" w:hAnsi="Microsoft YaHei"/>
+          <w:sz w:val="24"/>
+          <w:szCs w:val="24"/>
+        </w:rPr>
+      </w:pPr>
+      <w:r>
+        <w:rPr>
+          <w:rFonts w:ascii="Microsoft YaHei" w:eastAsia="Microsoft YaHei" w:hAnsi="Microsoft YaHei" w:hint="eastAsia"/>
+          <w:sz w:val="24"/>
+          <w:szCs w:val="24"/>
+        </w:rPr>
+        <w:t>{{</w:t>
+      </w:r>
+      <w:r>
+        <w:rPr>
+          <w:rFonts w:ascii="Microsoft YaHei" w:eastAsia="Microsoft YaHei" w:hAnsi="Microsoft YaHei"/>
+          <w:sz w:val="24"/>
+          <w:szCs w:val="24"/>
+        </w:rPr>
+        <w:t>#</w:t>
+      </w:r>
+      <w:proofErr w:type="spellStart"/>
+      <w:r>
+        <w:rPr>
+          <w:rFonts w:ascii="Microsoft YaHei" w:eastAsia="Microsoft YaHei" w:hAnsi="Microsoft YaHei" w:hint="eastAsia"/>
+          <w:sz w:val="24"/>
+          <w:szCs w:val="24"/>
+        </w:rPr>
+        <w:t>performance_report</w:t>
+      </w:r>
+      <w:proofErr w:type="spellEnd"/>
+      <w:r>
+        <w:rPr>
+          <w:rFonts w:ascii="Microsoft YaHei" w:eastAsia="Microsoft YaHei" w:hAnsi="Microsoft YaHei" w:hint="eastAsia"/>
+          <w:sz w:val="24"/>
+          <w:szCs w:val="24"/>
+        </w:rPr>
+        <w:t>}}</w:t>
+      </w:r>
     </w:p>
     <w:p>
       <w:pPr>
@@ -2702,7 +2960,7 @@
 </file>
 
 <file path=customXml/itemProps1.xml><?xml version="1.0" encoding="utf-8"?>
-<ds:datastoreItem xmlns:ds="http://schemas.openxmlformats.org/officeDocument/2006/customXml" ds:itemID="{B2F39607-AFCC-F54F-B5FC-42160B10BAF4}">
+<ds:datastoreItem xmlns:ds="http://schemas.openxmlformats.org/officeDocument/2006/customXml" ds:itemID="{A84F80AB-C75A-3C45-8E26-9486C44F0A03}">
   <ds:schemaRefs>
     <ds:schemaRef ds:uri="http://schemas.openxmlformats.org/officeDocument/2006/bibliography"/>
   </ds:schemaRefs>

</xml_diff>

<commit_message>
[YHAAO#2915] add signature. (#406)
* add signature.

* add place holder when there is no signature.
</commit_message>
<xml_diff>
--- a/src/src/main/resources/report/maintenance-template.docx
+++ b/src/src/main/resources/report/maintenance-template.docx
@@ -139,7 +139,6 @@
               </w:rPr>
               <w:t>{{</w:t>
             </w:r>
-            <w:proofErr w:type="spellStart"/>
             <w:r>
               <w:rPr>
                 <w:rFonts w:hint="eastAsia"/>
@@ -148,7 +147,6 @@
               </w:rPr>
               <w:t>device_name</w:t>
             </w:r>
-            <w:proofErr w:type="spellEnd"/>
             <w:r>
               <w:rPr>
                 <w:sz w:val="20"/>
@@ -204,23 +202,7 @@
                 <w:sz w:val="20"/>
                 <w:szCs w:val="20"/>
               </w:rPr>
-              <w:t>{{</w:t>
-            </w:r>
-            <w:proofErr w:type="spellStart"/>
-            <w:r>
-              <w:rPr>
-                <w:sz w:val="20"/>
-                <w:szCs w:val="20"/>
-              </w:rPr>
-              <w:t>device_department</w:t>
-            </w:r>
-            <w:proofErr w:type="spellEnd"/>
-            <w:r>
-              <w:rPr>
-                <w:sz w:val="20"/>
-                <w:szCs w:val="20"/>
-              </w:rPr>
-              <w:t>}}</w:t>
+              <w:t>{{device_department}}</w:t>
             </w:r>
           </w:p>
         </w:tc>
@@ -274,7 +256,6 @@
               </w:rPr>
               <w:t>{{</w:t>
             </w:r>
-            <w:proofErr w:type="spellStart"/>
             <w:r>
               <w:rPr>
                 <w:sz w:val="20"/>
@@ -282,7 +263,6 @@
               </w:rPr>
               <w:t>device_type</w:t>
             </w:r>
-            <w:proofErr w:type="spellEnd"/>
             <w:r>
               <w:rPr>
                 <w:sz w:val="20"/>
@@ -338,23 +318,7 @@
                 <w:sz w:val="20"/>
                 <w:szCs w:val="20"/>
               </w:rPr>
-              <w:t>{{</w:t>
-            </w:r>
-            <w:proofErr w:type="spellStart"/>
-            <w:r>
-              <w:rPr>
-                <w:sz w:val="20"/>
-                <w:szCs w:val="20"/>
-              </w:rPr>
-              <w:t>device_oem</w:t>
-            </w:r>
-            <w:proofErr w:type="spellEnd"/>
-            <w:r>
-              <w:rPr>
-                <w:sz w:val="20"/>
-                <w:szCs w:val="20"/>
-              </w:rPr>
-              <w:t>}}</w:t>
+              <w:t>{{device_oem}}</w:t>
             </w:r>
           </w:p>
         </w:tc>
@@ -400,7 +364,6 @@
               </w:rPr>
               <w:t>{{</w:t>
             </w:r>
-            <w:proofErr w:type="spellStart"/>
             <w:r>
               <w:rPr>
                 <w:sz w:val="20"/>
@@ -408,7 +371,6 @@
               </w:rPr>
               <w:t>device_serial</w:t>
             </w:r>
-            <w:proofErr w:type="spellEnd"/>
             <w:r>
               <w:rPr>
                 <w:sz w:val="20"/>
@@ -464,23 +426,7 @@
                 <w:sz w:val="20"/>
                 <w:szCs w:val="20"/>
               </w:rPr>
-              <w:t>{{</w:t>
-            </w:r>
-            <w:proofErr w:type="spellStart"/>
-            <w:r>
-              <w:rPr>
-                <w:sz w:val="20"/>
-                <w:szCs w:val="20"/>
-              </w:rPr>
-              <w:t>device_number</w:t>
-            </w:r>
-            <w:proofErr w:type="spellEnd"/>
-            <w:r>
-              <w:rPr>
-                <w:sz w:val="20"/>
-                <w:szCs w:val="20"/>
-              </w:rPr>
-              <w:t>}}</w:t>
+              <w:t>{{device_number}}</w:t>
             </w:r>
           </w:p>
         </w:tc>
@@ -534,7 +480,6 @@
               </w:rPr>
               <w:t>{{</w:t>
             </w:r>
-            <w:proofErr w:type="spellStart"/>
             <w:r>
               <w:rPr>
                 <w:sz w:val="20"/>
@@ -542,7 +487,6 @@
               </w:rPr>
               <w:t>device_qr</w:t>
             </w:r>
-            <w:proofErr w:type="spellEnd"/>
             <w:r>
               <w:rPr>
                 <w:sz w:val="20"/>
@@ -690,7 +634,6 @@
               </w:rPr>
               <w:t>{{</w:t>
             </w:r>
-            <w:proofErr w:type="spellStart"/>
             <w:r>
               <w:rPr>
                 <w:rFonts w:ascii="SimSun" w:eastAsia="SimSun" w:hAnsi="SimSun" w:cs="SimSun"/>
@@ -699,7 +642,6 @@
               </w:rPr>
               <w:t>maintenance_number</w:t>
             </w:r>
-            <w:proofErr w:type="spellEnd"/>
             <w:r>
               <w:rPr>
                 <w:rFonts w:ascii="SimSun" w:eastAsia="SimSun" w:hAnsi="SimSun" w:cs="SimSun"/>
@@ -754,25 +696,7 @@
                 <w:sz w:val="20"/>
                 <w:szCs w:val="20"/>
               </w:rPr>
-              <w:t>{{</w:t>
-            </w:r>
-            <w:proofErr w:type="spellStart"/>
-            <w:r>
-              <w:rPr>
-                <w:rFonts w:ascii="SimSun" w:eastAsia="SimSun" w:hAnsi="SimSun" w:cs="SimSun"/>
-                <w:sz w:val="20"/>
-                <w:szCs w:val="20"/>
-              </w:rPr>
-              <w:t>maintenance_creator</w:t>
-            </w:r>
-            <w:proofErr w:type="spellEnd"/>
-            <w:r>
-              <w:rPr>
-                <w:rFonts w:ascii="SimSun" w:eastAsia="SimSun" w:hAnsi="SimSun" w:cs="SimSun"/>
-                <w:sz w:val="20"/>
-                <w:szCs w:val="20"/>
-              </w:rPr>
-              <w:t>}}</w:t>
+              <w:t>{{maintenance_creator}}</w:t>
             </w:r>
           </w:p>
         </w:tc>
@@ -822,25 +746,7 @@
                 <w:sz w:val="20"/>
                 <w:szCs w:val="20"/>
               </w:rPr>
-              <w:t>{{</w:t>
-            </w:r>
-            <w:proofErr w:type="spellStart"/>
-            <w:r>
-              <w:rPr>
-                <w:rFonts w:ascii="SimSun" w:eastAsia="SimSun" w:hAnsi="SimSun" w:cs="SimSun"/>
-                <w:sz w:val="20"/>
-                <w:szCs w:val="20"/>
-              </w:rPr>
-              <w:t>maintenance_level</w:t>
-            </w:r>
-            <w:proofErr w:type="spellEnd"/>
-            <w:r>
-              <w:rPr>
-                <w:rFonts w:ascii="SimSun" w:eastAsia="SimSun" w:hAnsi="SimSun" w:cs="SimSun"/>
-                <w:sz w:val="20"/>
-                <w:szCs w:val="20"/>
-              </w:rPr>
-              <w:t>}}</w:t>
+              <w:t>{{maintenance_level}}</w:t>
             </w:r>
           </w:p>
         </w:tc>
@@ -888,25 +794,7 @@
                 <w:sz w:val="20"/>
                 <w:szCs w:val="20"/>
               </w:rPr>
-              <w:t>{{</w:t>
-            </w:r>
-            <w:proofErr w:type="spellStart"/>
-            <w:r>
-              <w:rPr>
-                <w:rFonts w:ascii="SimSun" w:eastAsia="SimSun" w:hAnsi="SimSun" w:cs="SimSun"/>
-                <w:sz w:val="20"/>
-                <w:szCs w:val="20"/>
-              </w:rPr>
-              <w:t>maintenance_type</w:t>
-            </w:r>
-            <w:proofErr w:type="spellEnd"/>
-            <w:r>
-              <w:rPr>
-                <w:rFonts w:ascii="SimSun" w:eastAsia="SimSun" w:hAnsi="SimSun" w:cs="SimSun"/>
-                <w:sz w:val="20"/>
-                <w:szCs w:val="20"/>
-              </w:rPr>
-              <w:t>}}</w:t>
+              <w:t>{{maintenance_type}}</w:t>
             </w:r>
           </w:p>
         </w:tc>
@@ -956,25 +844,7 @@
                 <w:sz w:val="20"/>
                 <w:szCs w:val="20"/>
               </w:rPr>
-              <w:t>{{</w:t>
-            </w:r>
-            <w:proofErr w:type="spellStart"/>
-            <w:r>
-              <w:rPr>
-                <w:rFonts w:ascii="SimSun" w:eastAsia="SimSun" w:hAnsi="SimSun" w:cs="SimSun"/>
-                <w:sz w:val="20"/>
-                <w:szCs w:val="20"/>
-              </w:rPr>
-              <w:t>maintenance_plan_time</w:t>
-            </w:r>
-            <w:proofErr w:type="spellEnd"/>
-            <w:r>
-              <w:rPr>
-                <w:rFonts w:ascii="SimSun" w:eastAsia="SimSun" w:hAnsi="SimSun" w:cs="SimSun"/>
-                <w:sz w:val="20"/>
-                <w:szCs w:val="20"/>
-              </w:rPr>
-              <w:t>}}</w:t>
+              <w:t>{{maintenance_plan_time}}</w:t>
             </w:r>
           </w:p>
         </w:tc>
@@ -1022,25 +892,7 @@
                 <w:sz w:val="20"/>
                 <w:szCs w:val="20"/>
               </w:rPr>
-              <w:t>{{</w:t>
-            </w:r>
-            <w:proofErr w:type="spellStart"/>
-            <w:r>
-              <w:rPr>
-                <w:rFonts w:ascii="SimSun" w:eastAsia="SimSun" w:hAnsi="SimSun" w:cs="SimSun"/>
-                <w:sz w:val="20"/>
-                <w:szCs w:val="20"/>
-              </w:rPr>
-              <w:t>maintenance_complete_time</w:t>
-            </w:r>
-            <w:proofErr w:type="spellEnd"/>
-            <w:r>
-              <w:rPr>
-                <w:rFonts w:ascii="SimSun" w:eastAsia="SimSun" w:hAnsi="SimSun" w:cs="SimSun"/>
-                <w:sz w:val="20"/>
-                <w:szCs w:val="20"/>
-              </w:rPr>
-              <w:t>}}</w:t>
+              <w:t>{{maintenance_complete_time}}</w:t>
             </w:r>
           </w:p>
         </w:tc>
@@ -1094,23 +946,7 @@
                 <w:sz w:val="20"/>
                 <w:szCs w:val="20"/>
               </w:rPr>
-              <w:t>{{</w:t>
-            </w:r>
-            <w:proofErr w:type="spellStart"/>
-            <w:r>
-              <w:rPr>
-                <w:sz w:val="20"/>
-                <w:szCs w:val="20"/>
-              </w:rPr>
-              <w:t>maintenance_op</w:t>
-            </w:r>
-            <w:proofErr w:type="spellEnd"/>
-            <w:r>
-              <w:rPr>
-                <w:sz w:val="20"/>
-                <w:szCs w:val="20"/>
-              </w:rPr>
-              <w:t>}}</w:t>
+              <w:t>{{maintenance_op}}</w:t>
             </w:r>
           </w:p>
         </w:tc>
@@ -1140,25 +976,7 @@
                 <w:sz w:val="20"/>
                 <w:szCs w:val="20"/>
               </w:rPr>
-              <w:t>{{</w:t>
-            </w:r>
-            <w:proofErr w:type="spellStart"/>
-            <w:r>
-              <w:rPr>
-                <w:rFonts w:hint="eastAsia"/>
-                <w:sz w:val="20"/>
-                <w:szCs w:val="20"/>
-              </w:rPr>
-              <w:t>maintenance_op_time</w:t>
-            </w:r>
-            <w:proofErr w:type="spellEnd"/>
-            <w:r>
-              <w:rPr>
-                <w:rFonts w:hint="eastAsia"/>
-                <w:sz w:val="20"/>
-                <w:szCs w:val="20"/>
-              </w:rPr>
-              <w:t>}}</w:t>
+              <w:t>{{maintenance_op_time}}</w:t>
             </w:r>
           </w:p>
         </w:tc>
@@ -1394,23 +1212,7 @@
                 <w:sz w:val="20"/>
                 <w:szCs w:val="20"/>
               </w:rPr>
-              <w:t>{{</w:t>
-            </w:r>
-            <w:proofErr w:type="spellStart"/>
-            <w:r>
-              <w:rPr>
-                <w:sz w:val="20"/>
-                <w:szCs w:val="20"/>
-              </w:rPr>
-              <w:t>maintenance_result</w:t>
-            </w:r>
-            <w:proofErr w:type="spellEnd"/>
-            <w:r>
-              <w:rPr>
-                <w:sz w:val="20"/>
-                <w:szCs w:val="20"/>
-              </w:rPr>
-              <w:t>}}</w:t>
+              <w:t>{{maintenance_result}}</w:t>
             </w:r>
           </w:p>
         </w:tc>
@@ -1608,11 +1410,9 @@
             <w:r>
               <w:t>{{</w:t>
             </w:r>
-            <w:proofErr w:type="spellStart"/>
             <w:r>
               <w:t>accessory_information</w:t>
             </w:r>
-            <w:proofErr w:type="spellEnd"/>
             <w:r>
               <w:t>}}</w:t>
             </w:r>
@@ -1620,6 +1420,25 @@
         </w:tc>
       </w:tr>
     </w:tbl>
+    <w:p>
+      <w:pPr>
+        <w:jc w:val="right"/>
+      </w:pPr>
+      <w:r>
+        <w:rPr>
+          <w:rFonts w:hint="eastAsia"/>
+        </w:rPr>
+        <w:t>审核人签名：</w:t>
+      </w:r>
+      <w:r>
+        <w:t>{{accessory_signature}}</w:t>
+      </w:r>
+      <w:r>
+        <w:t>{{accessory_signature_place_holder}}</w:t>
+      </w:r>
+      <w:bookmarkStart w:id="0" w:name="_GoBack"/>
+      <w:bookmarkEnd w:id="0"/>
+    </w:p>
     <w:p>
       <w:pPr>
         <w:jc w:val="center"/>
@@ -1756,15 +1575,7 @@
           </w:tcPr>
           <w:p>
             <w:r>
-              <w:t>{{</w:t>
-            </w:r>
-            <w:proofErr w:type="spellStart"/>
-            <w:r>
-              <w:t>maintenance_workflow</w:t>
-            </w:r>
-            <w:proofErr w:type="spellEnd"/>
-            <w:r>
-              <w:t>}}</w:t>
+              <w:t>{{maintenance_workflow}}</w:t>
             </w:r>
           </w:p>
         </w:tc>
@@ -1880,24 +1691,13 @@
           </w:tcPr>
           <w:p>
             <w:r>
-              <w:t>{{</w:t>
-            </w:r>
-            <w:proofErr w:type="spellStart"/>
-            <w:r>
-              <w:t>audit_records</w:t>
-            </w:r>
-            <w:proofErr w:type="spellEnd"/>
-            <w:r>
-              <w:t>}}</w:t>
+              <w:t>{{audit_records}}</w:t>
             </w:r>
           </w:p>
         </w:tc>
       </w:tr>
     </w:tbl>
-    <w:p>
-      <w:bookmarkStart w:id="0" w:name="_GoBack"/>
-      <w:bookmarkEnd w:id="0"/>
-    </w:p>
+    <w:p/>
     <w:p>
       <w:pPr>
         <w:jc w:val="center"/>
@@ -2029,15 +1829,7 @@
           </w:tcPr>
           <w:p>
             <w:r>
-              <w:t>{{</w:t>
-            </w:r>
-            <w:proofErr w:type="spellStart"/>
-            <w:r>
-              <w:t>check_list</w:t>
-            </w:r>
-            <w:proofErr w:type="spellEnd"/>
-            <w:r>
-              <w:t>}}</w:t>
+              <w:t>{{check_list}}</w:t>
             </w:r>
           </w:p>
         </w:tc>
@@ -2070,6 +1862,7 @@
           <w:sz w:val="24"/>
           <w:szCs w:val="24"/>
         </w:rPr>
+        <w:lastRenderedPageBreak/>
         <w:t>电气安全检测报告</w:t>
       </w:r>
     </w:p>
@@ -2088,7 +1881,6 @@
           <w:sz w:val="24"/>
           <w:szCs w:val="24"/>
         </w:rPr>
-        <w:lastRenderedPageBreak/>
         <w:t>{{</w:t>
       </w:r>
       <w:r>
@@ -2099,23 +1891,13 @@
         </w:rPr>
         <w:t>#</w:t>
       </w:r>
-      <w:proofErr w:type="spellStart"/>
       <w:r>
         <w:rPr>
           <w:rFonts w:ascii="Microsoft YaHei" w:eastAsia="Microsoft YaHei" w:hAnsi="Microsoft YaHei"/>
           <w:sz w:val="24"/>
           <w:szCs w:val="24"/>
         </w:rPr>
-        <w:t>safety_report</w:t>
-      </w:r>
-      <w:proofErr w:type="spellEnd"/>
-      <w:r>
-        <w:rPr>
-          <w:rFonts w:ascii="Microsoft YaHei" w:eastAsia="Microsoft YaHei" w:hAnsi="Microsoft YaHei"/>
-          <w:sz w:val="24"/>
-          <w:szCs w:val="24"/>
-        </w:rPr>
-        <w:t>}}</w:t>
+        <w:t>safety_report}}</w:t>
       </w:r>
     </w:p>
     <w:p>
@@ -2174,23 +1956,13 @@
         </w:rPr>
         <w:t>#</w:t>
       </w:r>
-      <w:proofErr w:type="spellStart"/>
       <w:r>
         <w:rPr>
           <w:rFonts w:ascii="Microsoft YaHei" w:eastAsia="Microsoft YaHei" w:hAnsi="Microsoft YaHei" w:hint="eastAsia"/>
           <w:sz w:val="24"/>
           <w:szCs w:val="24"/>
         </w:rPr>
-        <w:t>performance_report</w:t>
-      </w:r>
-      <w:proofErr w:type="spellEnd"/>
-      <w:r>
-        <w:rPr>
-          <w:rFonts w:ascii="Microsoft YaHei" w:eastAsia="Microsoft YaHei" w:hAnsi="Microsoft YaHei" w:hint="eastAsia"/>
-          <w:sz w:val="24"/>
-          <w:szCs w:val="24"/>
-        </w:rPr>
-        <w:t>}}</w:t>
+        <w:t>performance_report}}</w:t>
       </w:r>
     </w:p>
     <w:p>
@@ -2960,7 +2732,7 @@
 </file>
 
 <file path=customXml/itemProps1.xml><?xml version="1.0" encoding="utf-8"?>
-<ds:datastoreItem xmlns:ds="http://schemas.openxmlformats.org/officeDocument/2006/customXml" ds:itemID="{A84F80AB-C75A-3C45-8E26-9486C44F0A03}">
+<ds:datastoreItem xmlns:ds="http://schemas.openxmlformats.org/officeDocument/2006/customXml" ds:itemID="{688701A6-8CEE-084A-A36C-743EF289E0AA}">
   <ds:schemaRefs>
     <ds:schemaRef ds:uri="http://schemas.openxmlformats.org/officeDocument/2006/bibliography"/>
   </ds:schemaRefs>

</xml_diff>

<commit_message>
[YHAAO#2915] hide signature if the field is empty. (#409)
</commit_message>
<xml_diff>
--- a/src/src/main/resources/report/maintenance-template.docx
+++ b/src/src/main/resources/report/maintenance-template.docx
@@ -139,6 +139,7 @@
               </w:rPr>
               <w:t>{{</w:t>
             </w:r>
+            <w:proofErr w:type="spellStart"/>
             <w:r>
               <w:rPr>
                 <w:rFonts w:hint="eastAsia"/>
@@ -147,6 +148,7 @@
               </w:rPr>
               <w:t>device_name</w:t>
             </w:r>
+            <w:proofErr w:type="spellEnd"/>
             <w:r>
               <w:rPr>
                 <w:sz w:val="20"/>
@@ -202,7 +204,23 @@
                 <w:sz w:val="20"/>
                 <w:szCs w:val="20"/>
               </w:rPr>
-              <w:t>{{device_department}}</w:t>
+              <w:t>{{</w:t>
+            </w:r>
+            <w:proofErr w:type="spellStart"/>
+            <w:r>
+              <w:rPr>
+                <w:sz w:val="20"/>
+                <w:szCs w:val="20"/>
+              </w:rPr>
+              <w:t>device_department</w:t>
+            </w:r>
+            <w:proofErr w:type="spellEnd"/>
+            <w:r>
+              <w:rPr>
+                <w:sz w:val="20"/>
+                <w:szCs w:val="20"/>
+              </w:rPr>
+              <w:t>}}</w:t>
             </w:r>
           </w:p>
         </w:tc>
@@ -256,6 +274,7 @@
               </w:rPr>
               <w:t>{{</w:t>
             </w:r>
+            <w:proofErr w:type="spellStart"/>
             <w:r>
               <w:rPr>
                 <w:sz w:val="20"/>
@@ -263,6 +282,7 @@
               </w:rPr>
               <w:t>device_type</w:t>
             </w:r>
+            <w:proofErr w:type="spellEnd"/>
             <w:r>
               <w:rPr>
                 <w:sz w:val="20"/>
@@ -318,7 +338,23 @@
                 <w:sz w:val="20"/>
                 <w:szCs w:val="20"/>
               </w:rPr>
-              <w:t>{{device_oem}}</w:t>
+              <w:t>{{</w:t>
+            </w:r>
+            <w:proofErr w:type="spellStart"/>
+            <w:r>
+              <w:rPr>
+                <w:sz w:val="20"/>
+                <w:szCs w:val="20"/>
+              </w:rPr>
+              <w:t>device_oem</w:t>
+            </w:r>
+            <w:proofErr w:type="spellEnd"/>
+            <w:r>
+              <w:rPr>
+                <w:sz w:val="20"/>
+                <w:szCs w:val="20"/>
+              </w:rPr>
+              <w:t>}}</w:t>
             </w:r>
           </w:p>
         </w:tc>
@@ -364,6 +400,7 @@
               </w:rPr>
               <w:t>{{</w:t>
             </w:r>
+            <w:proofErr w:type="spellStart"/>
             <w:r>
               <w:rPr>
                 <w:sz w:val="20"/>
@@ -371,6 +408,7 @@
               </w:rPr>
               <w:t>device_serial</w:t>
             </w:r>
+            <w:proofErr w:type="spellEnd"/>
             <w:r>
               <w:rPr>
                 <w:sz w:val="20"/>
@@ -426,7 +464,23 @@
                 <w:sz w:val="20"/>
                 <w:szCs w:val="20"/>
               </w:rPr>
-              <w:t>{{device_number}}</w:t>
+              <w:t>{{</w:t>
+            </w:r>
+            <w:proofErr w:type="spellStart"/>
+            <w:r>
+              <w:rPr>
+                <w:sz w:val="20"/>
+                <w:szCs w:val="20"/>
+              </w:rPr>
+              <w:t>device_number</w:t>
+            </w:r>
+            <w:proofErr w:type="spellEnd"/>
+            <w:r>
+              <w:rPr>
+                <w:sz w:val="20"/>
+                <w:szCs w:val="20"/>
+              </w:rPr>
+              <w:t>}}</w:t>
             </w:r>
           </w:p>
         </w:tc>
@@ -480,6 +534,7 @@
               </w:rPr>
               <w:t>{{</w:t>
             </w:r>
+            <w:proofErr w:type="spellStart"/>
             <w:r>
               <w:rPr>
                 <w:sz w:val="20"/>
@@ -487,6 +542,7 @@
               </w:rPr>
               <w:t>device_qr</w:t>
             </w:r>
+            <w:proofErr w:type="spellEnd"/>
             <w:r>
               <w:rPr>
                 <w:sz w:val="20"/>
@@ -634,6 +690,7 @@
               </w:rPr>
               <w:t>{{</w:t>
             </w:r>
+            <w:proofErr w:type="spellStart"/>
             <w:r>
               <w:rPr>
                 <w:rFonts w:ascii="SimSun" w:eastAsia="SimSun" w:hAnsi="SimSun" w:cs="SimSun"/>
@@ -642,6 +699,7 @@
               </w:rPr>
               <w:t>maintenance_number</w:t>
             </w:r>
+            <w:proofErr w:type="spellEnd"/>
             <w:r>
               <w:rPr>
                 <w:rFonts w:ascii="SimSun" w:eastAsia="SimSun" w:hAnsi="SimSun" w:cs="SimSun"/>
@@ -696,7 +754,25 @@
                 <w:sz w:val="20"/>
                 <w:szCs w:val="20"/>
               </w:rPr>
-              <w:t>{{maintenance_creator}}</w:t>
+              <w:t>{{</w:t>
+            </w:r>
+            <w:proofErr w:type="spellStart"/>
+            <w:r>
+              <w:rPr>
+                <w:rFonts w:ascii="SimSun" w:eastAsia="SimSun" w:hAnsi="SimSun" w:cs="SimSun"/>
+                <w:sz w:val="20"/>
+                <w:szCs w:val="20"/>
+              </w:rPr>
+              <w:t>maintenance_creator</w:t>
+            </w:r>
+            <w:proofErr w:type="spellEnd"/>
+            <w:r>
+              <w:rPr>
+                <w:rFonts w:ascii="SimSun" w:eastAsia="SimSun" w:hAnsi="SimSun" w:cs="SimSun"/>
+                <w:sz w:val="20"/>
+                <w:szCs w:val="20"/>
+              </w:rPr>
+              <w:t>}}</w:t>
             </w:r>
           </w:p>
         </w:tc>
@@ -746,7 +822,25 @@
                 <w:sz w:val="20"/>
                 <w:szCs w:val="20"/>
               </w:rPr>
-              <w:t>{{maintenance_level}}</w:t>
+              <w:t>{{</w:t>
+            </w:r>
+            <w:proofErr w:type="spellStart"/>
+            <w:r>
+              <w:rPr>
+                <w:rFonts w:ascii="SimSun" w:eastAsia="SimSun" w:hAnsi="SimSun" w:cs="SimSun"/>
+                <w:sz w:val="20"/>
+                <w:szCs w:val="20"/>
+              </w:rPr>
+              <w:t>maintenance_level</w:t>
+            </w:r>
+            <w:proofErr w:type="spellEnd"/>
+            <w:r>
+              <w:rPr>
+                <w:rFonts w:ascii="SimSun" w:eastAsia="SimSun" w:hAnsi="SimSun" w:cs="SimSun"/>
+                <w:sz w:val="20"/>
+                <w:szCs w:val="20"/>
+              </w:rPr>
+              <w:t>}}</w:t>
             </w:r>
           </w:p>
         </w:tc>
@@ -794,7 +888,25 @@
                 <w:sz w:val="20"/>
                 <w:szCs w:val="20"/>
               </w:rPr>
-              <w:t>{{maintenance_type}}</w:t>
+              <w:t>{{</w:t>
+            </w:r>
+            <w:proofErr w:type="spellStart"/>
+            <w:r>
+              <w:rPr>
+                <w:rFonts w:ascii="SimSun" w:eastAsia="SimSun" w:hAnsi="SimSun" w:cs="SimSun"/>
+                <w:sz w:val="20"/>
+                <w:szCs w:val="20"/>
+              </w:rPr>
+              <w:t>maintenance_type</w:t>
+            </w:r>
+            <w:proofErr w:type="spellEnd"/>
+            <w:r>
+              <w:rPr>
+                <w:rFonts w:ascii="SimSun" w:eastAsia="SimSun" w:hAnsi="SimSun" w:cs="SimSun"/>
+                <w:sz w:val="20"/>
+                <w:szCs w:val="20"/>
+              </w:rPr>
+              <w:t>}}</w:t>
             </w:r>
           </w:p>
         </w:tc>
@@ -844,7 +956,25 @@
                 <w:sz w:val="20"/>
                 <w:szCs w:val="20"/>
               </w:rPr>
-              <w:t>{{maintenance_plan_time}}</w:t>
+              <w:t>{{</w:t>
+            </w:r>
+            <w:proofErr w:type="spellStart"/>
+            <w:r>
+              <w:rPr>
+                <w:rFonts w:ascii="SimSun" w:eastAsia="SimSun" w:hAnsi="SimSun" w:cs="SimSun"/>
+                <w:sz w:val="20"/>
+                <w:szCs w:val="20"/>
+              </w:rPr>
+              <w:t>maintenance_plan_time</w:t>
+            </w:r>
+            <w:proofErr w:type="spellEnd"/>
+            <w:r>
+              <w:rPr>
+                <w:rFonts w:ascii="SimSun" w:eastAsia="SimSun" w:hAnsi="SimSun" w:cs="SimSun"/>
+                <w:sz w:val="20"/>
+                <w:szCs w:val="20"/>
+              </w:rPr>
+              <w:t>}}</w:t>
             </w:r>
           </w:p>
         </w:tc>
@@ -892,7 +1022,25 @@
                 <w:sz w:val="20"/>
                 <w:szCs w:val="20"/>
               </w:rPr>
-              <w:t>{{maintenance_complete_time}}</w:t>
+              <w:t>{{</w:t>
+            </w:r>
+            <w:proofErr w:type="spellStart"/>
+            <w:r>
+              <w:rPr>
+                <w:rFonts w:ascii="SimSun" w:eastAsia="SimSun" w:hAnsi="SimSun" w:cs="SimSun"/>
+                <w:sz w:val="20"/>
+                <w:szCs w:val="20"/>
+              </w:rPr>
+              <w:t>maintenance_complete_time</w:t>
+            </w:r>
+            <w:proofErr w:type="spellEnd"/>
+            <w:r>
+              <w:rPr>
+                <w:rFonts w:ascii="SimSun" w:eastAsia="SimSun" w:hAnsi="SimSun" w:cs="SimSun"/>
+                <w:sz w:val="20"/>
+                <w:szCs w:val="20"/>
+              </w:rPr>
+              <w:t>}}</w:t>
             </w:r>
           </w:p>
         </w:tc>
@@ -946,7 +1094,23 @@
                 <w:sz w:val="20"/>
                 <w:szCs w:val="20"/>
               </w:rPr>
-              <w:t>{{maintenance_op}}</w:t>
+              <w:t>{{</w:t>
+            </w:r>
+            <w:proofErr w:type="spellStart"/>
+            <w:r>
+              <w:rPr>
+                <w:sz w:val="20"/>
+                <w:szCs w:val="20"/>
+              </w:rPr>
+              <w:t>maintenance_op</w:t>
+            </w:r>
+            <w:proofErr w:type="spellEnd"/>
+            <w:r>
+              <w:rPr>
+                <w:sz w:val="20"/>
+                <w:szCs w:val="20"/>
+              </w:rPr>
+              <w:t>}}</w:t>
             </w:r>
           </w:p>
         </w:tc>
@@ -976,7 +1140,25 @@
                 <w:sz w:val="20"/>
                 <w:szCs w:val="20"/>
               </w:rPr>
-              <w:t>{{maintenance_op_time}}</w:t>
+              <w:t>{{</w:t>
+            </w:r>
+            <w:proofErr w:type="spellStart"/>
+            <w:r>
+              <w:rPr>
+                <w:rFonts w:hint="eastAsia"/>
+                <w:sz w:val="20"/>
+                <w:szCs w:val="20"/>
+              </w:rPr>
+              <w:t>maintenance_op_time</w:t>
+            </w:r>
+            <w:proofErr w:type="spellEnd"/>
+            <w:r>
+              <w:rPr>
+                <w:rFonts w:hint="eastAsia"/>
+                <w:sz w:val="20"/>
+                <w:szCs w:val="20"/>
+              </w:rPr>
+              <w:t>}}</w:t>
             </w:r>
           </w:p>
         </w:tc>
@@ -1212,7 +1394,23 @@
                 <w:sz w:val="20"/>
                 <w:szCs w:val="20"/>
               </w:rPr>
-              <w:t>{{maintenance_result}}</w:t>
+              <w:t>{{</w:t>
+            </w:r>
+            <w:proofErr w:type="spellStart"/>
+            <w:r>
+              <w:rPr>
+                <w:sz w:val="20"/>
+                <w:szCs w:val="20"/>
+              </w:rPr>
+              <w:t>maintenance_result</w:t>
+            </w:r>
+            <w:proofErr w:type="spellEnd"/>
+            <w:r>
+              <w:rPr>
+                <w:sz w:val="20"/>
+                <w:szCs w:val="20"/>
+              </w:rPr>
+              <w:t>}}</w:t>
             </w:r>
           </w:p>
         </w:tc>
@@ -1410,9 +1608,11 @@
             <w:r>
               <w:t>{{</w:t>
             </w:r>
+            <w:proofErr w:type="spellStart"/>
             <w:r>
               <w:t>accessory_information</w:t>
             </w:r>
+            <w:proofErr w:type="spellEnd"/>
             <w:r>
               <w:t>}}</w:t>
             </w:r>
@@ -1425,19 +1625,32 @@
         <w:jc w:val="right"/>
       </w:pPr>
       <w:r>
-        <w:rPr>
-          <w:rFonts w:hint="eastAsia"/>
-        </w:rPr>
-        <w:t>审核人签名：</w:t>
-      </w:r>
-      <w:r>
-        <w:t>{{accessory_signature}}</w:t>
-      </w:r>
-      <w:r>
-        <w:t>{{accessory_signature_place_holder}}</w:t>
+        <w:t>{{</w:t>
+      </w:r>
+      <w:proofErr w:type="spellStart"/>
+      <w:r>
+        <w:t>accessory_si</w:t>
       </w:r>
       <w:bookmarkStart w:id="0" w:name="_GoBack"/>
       <w:bookmarkEnd w:id="0"/>
+      <w:r>
+        <w:t>gnature_place_holder</w:t>
+      </w:r>
+      <w:proofErr w:type="spellEnd"/>
+      <w:r>
+        <w:t>}}</w:t>
+      </w:r>
+      <w:r>
+        <w:t>{{</w:t>
+      </w:r>
+      <w:proofErr w:type="spellStart"/>
+      <w:r>
+        <w:t>accessory_signature</w:t>
+      </w:r>
+      <w:proofErr w:type="spellEnd"/>
+      <w:r>
+        <w:t>}}</w:t>
+      </w:r>
     </w:p>
     <w:p>
       <w:pPr>
@@ -1575,7 +1788,15 @@
           </w:tcPr>
           <w:p>
             <w:r>
-              <w:t>{{maintenance_workflow}}</w:t>
+              <w:t>{{</w:t>
+            </w:r>
+            <w:proofErr w:type="spellStart"/>
+            <w:r>
+              <w:t>maintenance_workflow</w:t>
+            </w:r>
+            <w:proofErr w:type="spellEnd"/>
+            <w:r>
+              <w:t>}}</w:t>
             </w:r>
           </w:p>
         </w:tc>
@@ -1691,7 +1912,15 @@
           </w:tcPr>
           <w:p>
             <w:r>
-              <w:t>{{audit_records}}</w:t>
+              <w:t>{{</w:t>
+            </w:r>
+            <w:proofErr w:type="spellStart"/>
+            <w:r>
+              <w:t>audit_records</w:t>
+            </w:r>
+            <w:proofErr w:type="spellEnd"/>
+            <w:r>
+              <w:t>}}</w:t>
             </w:r>
           </w:p>
         </w:tc>
@@ -1829,7 +2058,15 @@
           </w:tcPr>
           <w:p>
             <w:r>
-              <w:t>{{check_list}}</w:t>
+              <w:t>{{</w:t>
+            </w:r>
+            <w:proofErr w:type="spellStart"/>
+            <w:r>
+              <w:t>check_list</w:t>
+            </w:r>
+            <w:proofErr w:type="spellEnd"/>
+            <w:r>
+              <w:t>}}</w:t>
             </w:r>
           </w:p>
         </w:tc>
@@ -1891,13 +2128,23 @@
         </w:rPr>
         <w:t>#</w:t>
       </w:r>
+      <w:proofErr w:type="spellStart"/>
       <w:r>
         <w:rPr>
           <w:rFonts w:ascii="Microsoft YaHei" w:eastAsia="Microsoft YaHei" w:hAnsi="Microsoft YaHei"/>
           <w:sz w:val="24"/>
           <w:szCs w:val="24"/>
         </w:rPr>
-        <w:t>safety_report}}</w:t>
+        <w:t>safety_report</w:t>
+      </w:r>
+      <w:proofErr w:type="spellEnd"/>
+      <w:r>
+        <w:rPr>
+          <w:rFonts w:ascii="Microsoft YaHei" w:eastAsia="Microsoft YaHei" w:hAnsi="Microsoft YaHei"/>
+          <w:sz w:val="24"/>
+          <w:szCs w:val="24"/>
+        </w:rPr>
+        <w:t>}}</w:t>
       </w:r>
     </w:p>
     <w:p>
@@ -1956,13 +2203,23 @@
         </w:rPr>
         <w:t>#</w:t>
       </w:r>
+      <w:proofErr w:type="spellStart"/>
       <w:r>
         <w:rPr>
           <w:rFonts w:ascii="Microsoft YaHei" w:eastAsia="Microsoft YaHei" w:hAnsi="Microsoft YaHei" w:hint="eastAsia"/>
           <w:sz w:val="24"/>
           <w:szCs w:val="24"/>
         </w:rPr>
-        <w:t>performance_report}}</w:t>
+        <w:t>performance_report</w:t>
+      </w:r>
+      <w:proofErr w:type="spellEnd"/>
+      <w:r>
+        <w:rPr>
+          <w:rFonts w:ascii="Microsoft YaHei" w:eastAsia="Microsoft YaHei" w:hAnsi="Microsoft YaHei" w:hint="eastAsia"/>
+          <w:sz w:val="24"/>
+          <w:szCs w:val="24"/>
+        </w:rPr>
+        <w:t>}}</w:t>
       </w:r>
     </w:p>
     <w:p>
@@ -2732,7 +2989,7 @@
 </file>
 
 <file path=customXml/itemProps1.xml><?xml version="1.0" encoding="utf-8"?>
-<ds:datastoreItem xmlns:ds="http://schemas.openxmlformats.org/officeDocument/2006/customXml" ds:itemID="{688701A6-8CEE-084A-A36C-743EF289E0AA}">
+<ds:datastoreItem xmlns:ds="http://schemas.openxmlformats.org/officeDocument/2006/customXml" ds:itemID="{548644C9-82E4-1940-BAD7-4760C90BEA1E}">
   <ds:schemaRefs>
     <ds:schemaRef ds:uri="http://schemas.openxmlformats.org/officeDocument/2006/bibliography"/>
   </ds:schemaRefs>

</xml_diff>